<commit_message>
Actualización del documento y PDF
</commit_message>
<xml_diff>
--- a/SEMANA_04/TRABAJO 4.docx
+++ b/SEMANA_04/TRABAJO 4.docx
@@ -1,6 +1,6 @@
 
 <file path=word/document.xml><?xml version="1.0" encoding="utf-8"?>
-<w:document xmlns:wpc="http://schemas.microsoft.com/office/word/2010/wordprocessingCanvas" xmlns:cx="http://schemas.microsoft.com/office/drawing/2014/chartex" xmlns:cx1="http://schemas.microsoft.com/office/drawing/2015/9/8/chartex" xmlns:cx2="http://schemas.microsoft.com/office/drawing/2015/10/21/chartex" xmlns:cx3="http://schemas.microsoft.com/office/drawing/2016/5/9/chartex" xmlns:cx4="http://schemas.microsoft.com/office/drawing/2016/5/10/chartex" xmlns:cx5="http://schemas.microsoft.com/office/drawing/2016/5/11/chartex" xmlns:cx6="http://schemas.microsoft.com/office/drawing/2016/5/12/chartex" xmlns:cx7="http://schemas.microsoft.com/office/drawing/2016/5/13/chartex" xmlns:cx8="http://schemas.microsoft.com/office/drawing/2016/5/14/chartex" xmlns:mc="http://schemas.openxmlformats.org/markup-compatibility/2006" xmlns:aink="http://schemas.microsoft.com/office/drawing/2016/ink" xmlns:am3d="http://schemas.microsoft.com/office/drawing/2017/model3d" xmlns:o="urn:schemas-microsoft-com:office:office" xmlns:oel="http://schemas.microsoft.com/office/2019/extlst" xmlns:r="http://schemas.openxmlformats.org/officeDocument/2006/relationships" xmlns:m="http://schemas.openxmlformats.org/officeDocument/2006/math" xmlns:v="urn:schemas-microsoft-com:vml" xmlns:wp14="http://schemas.microsoft.com/office/word/2010/wordprocessingDrawing" xmlns:wp="http://schemas.openxmlformats.org/drawingml/2006/wordprocessingDrawing" xmlns:w10="urn:schemas-microsoft-com:office:word" xmlns:w="http://schemas.openxmlformats.org/wordprocessingml/2006/main" xmlns:w14="http://schemas.microsoft.com/office/word/2010/wordml" xmlns:w15="http://schemas.microsoft.com/office/word/2012/wordml" xmlns:w16cex="http://schemas.microsoft.com/office/word/2018/wordml/cex" xmlns:w16cid="http://schemas.microsoft.com/office/word/2016/wordml/cid" xmlns:w16="http://schemas.microsoft.com/office/word/2018/wordml" xmlns:w16du="http://schemas.microsoft.com/office/word/2023/wordml/word16du" xmlns:w16sdtdh="http://schemas.microsoft.com/office/word/2020/wordml/sdtdatahash" xmlns:w16sdtfl="http://schemas.microsoft.com/office/word/2024/wordml/sdtformatlock" xmlns:w16se="http://schemas.microsoft.com/office/word/2015/wordml/symex" xmlns:wpg="http://schemas.microsoft.com/office/word/2010/wordprocessingGroup" xmlns:wpi="http://schemas.microsoft.com/office/word/2010/wordprocessingInk" xmlns:wne="http://schemas.microsoft.com/office/word/2006/wordml" xmlns:wps="http://schemas.microsoft.com/office/word/2010/wordprocessingShape" mc:Ignorable="w14 w15 w16se w16cid w16 w16cex w16sdtdh w16sdtfl w16du wp14">
+<w:document xmlns:wpc="http://schemas.microsoft.com/office/word/2010/wordprocessingCanvas" xmlns:cx="http://schemas.microsoft.com/office/drawing/2014/chartex" xmlns:cx1="http://schemas.microsoft.com/office/drawing/2015/9/8/chartex" xmlns:cx2="http://schemas.microsoft.com/office/drawing/2015/10/21/chartex" xmlns:cx3="http://schemas.microsoft.com/office/drawing/2016/5/9/chartex" xmlns:cx4="http://schemas.microsoft.com/office/drawing/2016/5/10/chartex" xmlns:cx5="http://schemas.microsoft.com/office/drawing/2016/5/11/chartex" xmlns:cx6="http://schemas.microsoft.com/office/drawing/2016/5/12/chartex" xmlns:cx7="http://schemas.microsoft.com/office/drawing/2016/5/13/chartex" xmlns:cx8="http://schemas.microsoft.com/office/drawing/2016/5/14/chartex" xmlns:mc="http://schemas.openxmlformats.org/markup-compatibility/2006" xmlns:aink="http://schemas.microsoft.com/office/drawing/2016/ink" xmlns:am3d="http://schemas.microsoft.com/office/drawing/2017/model3d" xmlns:o="urn:schemas-microsoft-com:office:office" xmlns:r="http://schemas.openxmlformats.org/officeDocument/2006/relationships" xmlns:m="http://schemas.openxmlformats.org/officeDocument/2006/math" xmlns:v="urn:schemas-microsoft-com:vml" xmlns:wp14="http://schemas.microsoft.com/office/word/2010/wordprocessingDrawing" xmlns:wp="http://schemas.openxmlformats.org/drawingml/2006/wordprocessingDrawing" xmlns:w10="urn:schemas-microsoft-com:office:word" xmlns:w="http://schemas.openxmlformats.org/wordprocessingml/2006/main" xmlns:w14="http://schemas.microsoft.com/office/word/2010/wordml" xmlns:w15="http://schemas.microsoft.com/office/word/2012/wordml" xmlns:w16cex="http://schemas.microsoft.com/office/word/2018/wordml/cex" xmlns:w16cid="http://schemas.microsoft.com/office/word/2016/wordml/cid" xmlns:w16="http://schemas.microsoft.com/office/word/2018/wordml" xmlns:w16sdtdh="http://schemas.microsoft.com/office/word/2020/wordml/sdtdatahash" xmlns:w16se="http://schemas.microsoft.com/office/word/2015/wordml/symex" xmlns:wpg="http://schemas.microsoft.com/office/word/2010/wordprocessingGroup" xmlns:wpi="http://schemas.microsoft.com/office/word/2010/wordprocessingInk" xmlns:wne="http://schemas.microsoft.com/office/word/2006/wordml" xmlns:wps="http://schemas.microsoft.com/office/word/2010/wordprocessingShape" mc:Ignorable="w14 w15 w16se w16cid w16 w16cex w16sdtdh wp14">
   <w:body>
     <w:p>
       <w:pPr>
@@ -96,7 +96,7 @@
               </wp:anchor>
             </w:drawing>
           </mc:Choice>
-          <mc:Fallback>
+          <mc:Fallback xmlns:w16sdtfl="http://schemas.microsoft.com/office/word/2024/wordml/sdtformatlock" xmlns:w16du="http://schemas.microsoft.com/office/word/2023/wordml/word16du" xmlns:oel="http://schemas.microsoft.com/office/2019/extlst">
             <w:pict>
               <v:line w14:anchorId="4D6D9E29" id="Conector recto 1" o:spid="_x0000_s1026" style="position:absolute;z-index:251659264;visibility:visible;mso-wrap-style:square;mso-wrap-distance-left:9pt;mso-wrap-distance-top:0;mso-wrap-distance-right:9pt;mso-wrap-distance-bottom:0;mso-position-horizontal:absolute;mso-position-horizontal-relative:text;mso-position-vertical:absolute;mso-position-vertical-relative:text" from="24.75pt,35.65pt" to="435.75pt,35.65pt" o:gfxdata="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" strokecolor="black [3200]" strokeweight=".5pt">
                 <v:stroke joinstyle="miter"/>
@@ -113,7 +113,37 @@
           <w:sz w:val="24"/>
           <w:szCs w:val="24"/>
         </w:rPr>
-        <w:t>TEMA 3 MANIPULACIÓN DEL DOM Y EVENTOS</w:t>
+        <w:t xml:space="preserve">TEMA </w:t>
+      </w:r>
+      <w:r>
+        <w:rPr>
+          <w:rFonts w:ascii="Times New Roman" w:hAnsi="Times New Roman" w:cs="Times New Roman"/>
+          <w:b/>
+          <w:bCs/>
+          <w:sz w:val="24"/>
+          <w:szCs w:val="24"/>
+        </w:rPr>
+        <w:t>4</w:t>
+      </w:r>
+      <w:r>
+        <w:rPr>
+          <w:rFonts w:ascii="Times New Roman" w:hAnsi="Times New Roman" w:cs="Times New Roman"/>
+          <w:b/>
+          <w:bCs/>
+          <w:sz w:val="24"/>
+          <w:szCs w:val="24"/>
+        </w:rPr>
+        <w:t>:</w:t>
+      </w:r>
+      <w:r>
+        <w:rPr>
+          <w:rFonts w:ascii="Times New Roman" w:hAnsi="Times New Roman" w:cs="Times New Roman"/>
+          <w:b/>
+          <w:bCs/>
+          <w:sz w:val="24"/>
+          <w:szCs w:val="24"/>
+        </w:rPr>
+        <w:t xml:space="preserve"> MANIPULACIÓN DEL DOM Y EVENTOS</w:t>
       </w:r>
     </w:p>
     <w:p>
@@ -593,23 +623,13 @@
                 <w:szCs w:val="24"/>
               </w:rPr>
             </w:pPr>
-            <w:proofErr w:type="spellStart"/>
             <w:r>
               <w:rPr>
                 <w:rFonts w:ascii="Times New Roman" w:hAnsi="Times New Roman" w:cs="Times New Roman"/>
                 <w:sz w:val="24"/>
                 <w:szCs w:val="24"/>
               </w:rPr>
-              <w:t>Geradth</w:t>
-            </w:r>
-            <w:proofErr w:type="spellEnd"/>
-            <w:r>
-              <w:rPr>
-                <w:rFonts w:ascii="Times New Roman" w:hAnsi="Times New Roman" w:cs="Times New Roman"/>
-                <w:sz w:val="24"/>
-                <w:szCs w:val="24"/>
-              </w:rPr>
-              <w:t xml:space="preserve"> Humberto</w:t>
+              <w:t>Geradth Humberto</w:t>
             </w:r>
           </w:p>
         </w:tc>
@@ -683,23 +703,13 @@
                 <w:szCs w:val="24"/>
               </w:rPr>
             </w:pPr>
-            <w:proofErr w:type="spellStart"/>
             <w:r>
               <w:rPr>
                 <w:rFonts w:ascii="Times New Roman" w:hAnsi="Times New Roman" w:cs="Times New Roman"/>
                 <w:sz w:val="24"/>
                 <w:szCs w:val="24"/>
               </w:rPr>
-              <w:t>Huisa</w:t>
-            </w:r>
-            <w:proofErr w:type="spellEnd"/>
-            <w:r>
-              <w:rPr>
-                <w:rFonts w:ascii="Times New Roman" w:hAnsi="Times New Roman" w:cs="Times New Roman"/>
-                <w:sz w:val="24"/>
-                <w:szCs w:val="24"/>
-              </w:rPr>
-              <w:t xml:space="preserve"> Valle,</w:t>
+              <w:t>Huisa Valle,</w:t>
             </w:r>
           </w:p>
           <w:p>
@@ -883,25 +893,7 @@
           <w:sz w:val="24"/>
           <w:szCs w:val="24"/>
         </w:rPr>
-        <w:t xml:space="preserve">Docente: </w:t>
-      </w:r>
-      <w:proofErr w:type="spellStart"/>
-      <w:r>
-        <w:rPr>
-          <w:rFonts w:ascii="Times New Roman" w:hAnsi="Times New Roman" w:cs="Times New Roman"/>
-          <w:sz w:val="24"/>
-          <w:szCs w:val="24"/>
-        </w:rPr>
-        <w:t>Victor</w:t>
-      </w:r>
-      <w:proofErr w:type="spellEnd"/>
-      <w:r>
-        <w:rPr>
-          <w:rFonts w:ascii="Times New Roman" w:hAnsi="Times New Roman" w:cs="Times New Roman"/>
-          <w:sz w:val="24"/>
-          <w:szCs w:val="24"/>
-        </w:rPr>
-        <w:t xml:space="preserve"> Jaime Polo Romero</w:t>
+        <w:t>Docente: Victor Jaime Polo Romero</w:t>
       </w:r>
     </w:p>
     <w:p>
@@ -1610,25 +1602,7 @@
           <w:sz w:val="24"/>
           <w:szCs w:val="24"/>
         </w:rPr>
-        <w:t xml:space="preserve">El evento </w:t>
-      </w:r>
-      <w:proofErr w:type="spellStart"/>
-      <w:r>
-        <w:rPr>
-          <w:rFonts w:ascii="Times New Roman" w:hAnsi="Times New Roman" w:cs="Times New Roman"/>
-          <w:sz w:val="24"/>
-          <w:szCs w:val="24"/>
-        </w:rPr>
-        <w:t>click</w:t>
-      </w:r>
-      <w:proofErr w:type="spellEnd"/>
-      <w:r>
-        <w:rPr>
-          <w:rFonts w:ascii="Times New Roman" w:hAnsi="Times New Roman" w:cs="Times New Roman"/>
-          <w:sz w:val="24"/>
-          <w:szCs w:val="24"/>
-        </w:rPr>
-        <w:t xml:space="preserve"> representa una abstracción de alto nivel para la interacción del usuario con un elemento.</w:t>
+        <w:t>El evento click representa una abstracción de alto nivel para la interacción del usuario con un elemento.</w:t>
       </w:r>
       <w:r>
         <w:rPr>
@@ -2089,6 +2063,7 @@
       <w:r>
         <w:rPr>
           <w:rFonts w:ascii="Times New Roman" w:hAnsi="Times New Roman" w:cs="Times New Roman"/>
+          <w:noProof/>
           <w:sz w:val="24"/>
           <w:szCs w:val="24"/>
         </w:rPr>
@@ -2144,6 +2119,7 @@
       <w:r>
         <w:rPr>
           <w:rFonts w:ascii="Times New Roman" w:hAnsi="Times New Roman" w:cs="Times New Roman"/>
+          <w:noProof/>
           <w:sz w:val="24"/>
           <w:szCs w:val="24"/>
         </w:rPr>
@@ -2198,6 +2174,7 @@
       <w:r>
         <w:rPr>
           <w:rFonts w:ascii="Times New Roman" w:hAnsi="Times New Roman" w:cs="Times New Roman"/>
+          <w:noProof/>
           <w:sz w:val="24"/>
           <w:szCs w:val="24"/>
         </w:rPr>
@@ -2253,6 +2230,7 @@
       <w:r>
         <w:rPr>
           <w:rFonts w:ascii="Times New Roman" w:hAnsi="Times New Roman" w:cs="Times New Roman"/>
+          <w:noProof/>
           <w:sz w:val="24"/>
           <w:szCs w:val="24"/>
         </w:rPr>
@@ -2358,7 +2336,6 @@
               <w:lang w:val="en-US"/>
             </w:rPr>
           </w:pPr>
-          <w:proofErr w:type="spellStart"/>
           <w:r>
             <w:rPr>
               <w:rFonts w:ascii="Times New Roman" w:hAnsi="Times New Roman" w:cs="Times New Roman"/>
@@ -2371,13 +2348,13 @@
             </w:rPr>
             <w:t>Referencias</w:t>
           </w:r>
-          <w:proofErr w:type="spellEnd"/>
         </w:p>
         <w:sdt>
           <w:sdtPr>
             <w:id w:val="-573587230"/>
             <w:bibliography/>
           </w:sdtPr>
+          <w:sdtEndPr/>
           <w:sdtContent>
             <w:p>
               <w:pPr>
@@ -2650,7 +2627,7 @@
 </file>
 
 <file path=word/endnotes.xml><?xml version="1.0" encoding="utf-8"?>
-<w:endnotes xmlns:wpc="http://schemas.microsoft.com/office/word/2010/wordprocessingCanvas" xmlns:cx="http://schemas.microsoft.com/office/drawing/2014/chartex" xmlns:cx1="http://schemas.microsoft.com/office/drawing/2015/9/8/chartex" xmlns:cx2="http://schemas.microsoft.com/office/drawing/2015/10/21/chartex" xmlns:cx3="http://schemas.microsoft.com/office/drawing/2016/5/9/chartex" xmlns:cx4="http://schemas.microsoft.com/office/drawing/2016/5/10/chartex" xmlns:cx5="http://schemas.microsoft.com/office/drawing/2016/5/11/chartex" xmlns:cx6="http://schemas.microsoft.com/office/drawing/2016/5/12/chartex" xmlns:cx7="http://schemas.microsoft.com/office/drawing/2016/5/13/chartex" xmlns:cx8="http://schemas.microsoft.com/office/drawing/2016/5/14/chartex" xmlns:mc="http://schemas.openxmlformats.org/markup-compatibility/2006" xmlns:aink="http://schemas.microsoft.com/office/drawing/2016/ink" xmlns:am3d="http://schemas.microsoft.com/office/drawing/2017/model3d" xmlns:o="urn:schemas-microsoft-com:office:office" xmlns:oel="http://schemas.microsoft.com/office/2019/extlst" xmlns:r="http://schemas.openxmlformats.org/officeDocument/2006/relationships" xmlns:m="http://schemas.openxmlformats.org/officeDocument/2006/math" xmlns:v="urn:schemas-microsoft-com:vml" xmlns:wp14="http://schemas.microsoft.com/office/word/2010/wordprocessingDrawing" xmlns:wp="http://schemas.openxmlformats.org/drawingml/2006/wordprocessingDrawing" xmlns:w10="urn:schemas-microsoft-com:office:word" xmlns:w="http://schemas.openxmlformats.org/wordprocessingml/2006/main" xmlns:w14="http://schemas.microsoft.com/office/word/2010/wordml" xmlns:w15="http://schemas.microsoft.com/office/word/2012/wordml" xmlns:w16cex="http://schemas.microsoft.com/office/word/2018/wordml/cex" xmlns:w16cid="http://schemas.microsoft.com/office/word/2016/wordml/cid" xmlns:w16="http://schemas.microsoft.com/office/word/2018/wordml" xmlns:w16du="http://schemas.microsoft.com/office/word/2023/wordml/word16du" xmlns:w16sdtdh="http://schemas.microsoft.com/office/word/2020/wordml/sdtdatahash" xmlns:w16sdtfl="http://schemas.microsoft.com/office/word/2024/wordml/sdtformatlock" xmlns:w16se="http://schemas.microsoft.com/office/word/2015/wordml/symex" xmlns:wpg="http://schemas.microsoft.com/office/word/2010/wordprocessingGroup" xmlns:wpi="http://schemas.microsoft.com/office/word/2010/wordprocessingInk" xmlns:wne="http://schemas.microsoft.com/office/word/2006/wordml" xmlns:wps="http://schemas.microsoft.com/office/word/2010/wordprocessingShape" mc:Ignorable="w14 w15 w16se w16cid w16 w16cex w16sdtdh w16sdtfl w16du wp14">
+<w:endnotes xmlns:wpc="http://schemas.microsoft.com/office/word/2010/wordprocessingCanvas" xmlns:cx="http://schemas.microsoft.com/office/drawing/2014/chartex" xmlns:cx1="http://schemas.microsoft.com/office/drawing/2015/9/8/chartex" xmlns:cx2="http://schemas.microsoft.com/office/drawing/2015/10/21/chartex" xmlns:cx3="http://schemas.microsoft.com/office/drawing/2016/5/9/chartex" xmlns:cx4="http://schemas.microsoft.com/office/drawing/2016/5/10/chartex" xmlns:cx5="http://schemas.microsoft.com/office/drawing/2016/5/11/chartex" xmlns:cx6="http://schemas.microsoft.com/office/drawing/2016/5/12/chartex" xmlns:cx7="http://schemas.microsoft.com/office/drawing/2016/5/13/chartex" xmlns:cx8="http://schemas.microsoft.com/office/drawing/2016/5/14/chartex" xmlns:mc="http://schemas.openxmlformats.org/markup-compatibility/2006" xmlns:aink="http://schemas.microsoft.com/office/drawing/2016/ink" xmlns:am3d="http://schemas.microsoft.com/office/drawing/2017/model3d" xmlns:o="urn:schemas-microsoft-com:office:office" xmlns:r="http://schemas.openxmlformats.org/officeDocument/2006/relationships" xmlns:m="http://schemas.openxmlformats.org/officeDocument/2006/math" xmlns:v="urn:schemas-microsoft-com:vml" xmlns:wp14="http://schemas.microsoft.com/office/word/2010/wordprocessingDrawing" xmlns:wp="http://schemas.openxmlformats.org/drawingml/2006/wordprocessingDrawing" xmlns:w10="urn:schemas-microsoft-com:office:word" xmlns:w="http://schemas.openxmlformats.org/wordprocessingml/2006/main" xmlns:w14="http://schemas.microsoft.com/office/word/2010/wordml" xmlns:w15="http://schemas.microsoft.com/office/word/2012/wordml" xmlns:w16cex="http://schemas.microsoft.com/office/word/2018/wordml/cex" xmlns:w16cid="http://schemas.microsoft.com/office/word/2016/wordml/cid" xmlns:w16="http://schemas.microsoft.com/office/word/2018/wordml" xmlns:w16sdtdh="http://schemas.microsoft.com/office/word/2020/wordml/sdtdatahash" xmlns:w16se="http://schemas.microsoft.com/office/word/2015/wordml/symex" xmlns:wpg="http://schemas.microsoft.com/office/word/2010/wordprocessingGroup" xmlns:wpi="http://schemas.microsoft.com/office/word/2010/wordprocessingInk" xmlns:wne="http://schemas.microsoft.com/office/word/2006/wordml" xmlns:wps="http://schemas.microsoft.com/office/word/2010/wordprocessingShape" mc:Ignorable="w14 w15 w16se w16cid w16 w16cex w16sdtdh wp14">
   <w:endnote w:type="separator" w:id="-1">
     <w:p>
       <w:pPr>
@@ -2675,7 +2652,7 @@
 </file>
 
 <file path=word/footnotes.xml><?xml version="1.0" encoding="utf-8"?>
-<w:footnotes xmlns:wpc="http://schemas.microsoft.com/office/word/2010/wordprocessingCanvas" xmlns:cx="http://schemas.microsoft.com/office/drawing/2014/chartex" xmlns:cx1="http://schemas.microsoft.com/office/drawing/2015/9/8/chartex" xmlns:cx2="http://schemas.microsoft.com/office/drawing/2015/10/21/chartex" xmlns:cx3="http://schemas.microsoft.com/office/drawing/2016/5/9/chartex" xmlns:cx4="http://schemas.microsoft.com/office/drawing/2016/5/10/chartex" xmlns:cx5="http://schemas.microsoft.com/office/drawing/2016/5/11/chartex" xmlns:cx6="http://schemas.microsoft.com/office/drawing/2016/5/12/chartex" xmlns:cx7="http://schemas.microsoft.com/office/drawing/2016/5/13/chartex" xmlns:cx8="http://schemas.microsoft.com/office/drawing/2016/5/14/chartex" xmlns:mc="http://schemas.openxmlformats.org/markup-compatibility/2006" xmlns:aink="http://schemas.microsoft.com/office/drawing/2016/ink" xmlns:am3d="http://schemas.microsoft.com/office/drawing/2017/model3d" xmlns:o="urn:schemas-microsoft-com:office:office" xmlns:oel="http://schemas.microsoft.com/office/2019/extlst" xmlns:r="http://schemas.openxmlformats.org/officeDocument/2006/relationships" xmlns:m="http://schemas.openxmlformats.org/officeDocument/2006/math" xmlns:v="urn:schemas-microsoft-com:vml" xmlns:wp14="http://schemas.microsoft.com/office/word/2010/wordprocessingDrawing" xmlns:wp="http://schemas.openxmlformats.org/drawingml/2006/wordprocessingDrawing" xmlns:w10="urn:schemas-microsoft-com:office:word" xmlns:w="http://schemas.openxmlformats.org/wordprocessingml/2006/main" xmlns:w14="http://schemas.microsoft.com/office/word/2010/wordml" xmlns:w15="http://schemas.microsoft.com/office/word/2012/wordml" xmlns:w16cex="http://schemas.microsoft.com/office/word/2018/wordml/cex" xmlns:w16cid="http://schemas.microsoft.com/office/word/2016/wordml/cid" xmlns:w16="http://schemas.microsoft.com/office/word/2018/wordml" xmlns:w16du="http://schemas.microsoft.com/office/word/2023/wordml/word16du" xmlns:w16sdtdh="http://schemas.microsoft.com/office/word/2020/wordml/sdtdatahash" xmlns:w16sdtfl="http://schemas.microsoft.com/office/word/2024/wordml/sdtformatlock" xmlns:w16se="http://schemas.microsoft.com/office/word/2015/wordml/symex" xmlns:wpg="http://schemas.microsoft.com/office/word/2010/wordprocessingGroup" xmlns:wpi="http://schemas.microsoft.com/office/word/2010/wordprocessingInk" xmlns:wne="http://schemas.microsoft.com/office/word/2006/wordml" xmlns:wps="http://schemas.microsoft.com/office/word/2010/wordprocessingShape" mc:Ignorable="w14 w15 w16se w16cid w16 w16cex w16sdtdh w16sdtfl w16du wp14">
+<w:footnotes xmlns:wpc="http://schemas.microsoft.com/office/word/2010/wordprocessingCanvas" xmlns:cx="http://schemas.microsoft.com/office/drawing/2014/chartex" xmlns:cx1="http://schemas.microsoft.com/office/drawing/2015/9/8/chartex" xmlns:cx2="http://schemas.microsoft.com/office/drawing/2015/10/21/chartex" xmlns:cx3="http://schemas.microsoft.com/office/drawing/2016/5/9/chartex" xmlns:cx4="http://schemas.microsoft.com/office/drawing/2016/5/10/chartex" xmlns:cx5="http://schemas.microsoft.com/office/drawing/2016/5/11/chartex" xmlns:cx6="http://schemas.microsoft.com/office/drawing/2016/5/12/chartex" xmlns:cx7="http://schemas.microsoft.com/office/drawing/2016/5/13/chartex" xmlns:cx8="http://schemas.microsoft.com/office/drawing/2016/5/14/chartex" xmlns:mc="http://schemas.openxmlformats.org/markup-compatibility/2006" xmlns:aink="http://schemas.microsoft.com/office/drawing/2016/ink" xmlns:am3d="http://schemas.microsoft.com/office/drawing/2017/model3d" xmlns:o="urn:schemas-microsoft-com:office:office" xmlns:r="http://schemas.openxmlformats.org/officeDocument/2006/relationships" xmlns:m="http://schemas.openxmlformats.org/officeDocument/2006/math" xmlns:v="urn:schemas-microsoft-com:vml" xmlns:wp14="http://schemas.microsoft.com/office/word/2010/wordprocessingDrawing" xmlns:wp="http://schemas.openxmlformats.org/drawingml/2006/wordprocessingDrawing" xmlns:w10="urn:schemas-microsoft-com:office:word" xmlns:w="http://schemas.openxmlformats.org/wordprocessingml/2006/main" xmlns:w14="http://schemas.microsoft.com/office/word/2010/wordml" xmlns:w15="http://schemas.microsoft.com/office/word/2012/wordml" xmlns:w16cex="http://schemas.microsoft.com/office/word/2018/wordml/cex" xmlns:w16cid="http://schemas.microsoft.com/office/word/2016/wordml/cid" xmlns:w16="http://schemas.microsoft.com/office/word/2018/wordml" xmlns:w16sdtdh="http://schemas.microsoft.com/office/word/2020/wordml/sdtdatahash" xmlns:w16se="http://schemas.microsoft.com/office/word/2015/wordml/symex" xmlns:wpg="http://schemas.microsoft.com/office/word/2010/wordprocessingGroup" xmlns:wpi="http://schemas.microsoft.com/office/word/2010/wordprocessingInk" xmlns:wne="http://schemas.microsoft.com/office/word/2006/wordml" xmlns:wps="http://schemas.microsoft.com/office/word/2010/wordprocessingShape" mc:Ignorable="w14 w15 w16se w16cid w16 w16cex w16sdtdh wp14">
   <w:footnote w:type="separator" w:id="-1">
     <w:p>
       <w:pPr>
@@ -2700,7 +2677,7 @@
 </file>
 
 <file path=word/header1.xml><?xml version="1.0" encoding="utf-8"?>
-<w:hdr xmlns:wpc="http://schemas.microsoft.com/office/word/2010/wordprocessingCanvas" xmlns:cx="http://schemas.microsoft.com/office/drawing/2014/chartex" xmlns:cx1="http://schemas.microsoft.com/office/drawing/2015/9/8/chartex" xmlns:cx2="http://schemas.microsoft.com/office/drawing/2015/10/21/chartex" xmlns:cx3="http://schemas.microsoft.com/office/drawing/2016/5/9/chartex" xmlns:cx4="http://schemas.microsoft.com/office/drawing/2016/5/10/chartex" xmlns:cx5="http://schemas.microsoft.com/office/drawing/2016/5/11/chartex" xmlns:cx6="http://schemas.microsoft.com/office/drawing/2016/5/12/chartex" xmlns:cx7="http://schemas.microsoft.com/office/drawing/2016/5/13/chartex" xmlns:cx8="http://schemas.microsoft.com/office/drawing/2016/5/14/chartex" xmlns:mc="http://schemas.openxmlformats.org/markup-compatibility/2006" xmlns:aink="http://schemas.microsoft.com/office/drawing/2016/ink" xmlns:am3d="http://schemas.microsoft.com/office/drawing/2017/model3d" xmlns:o="urn:schemas-microsoft-com:office:office" xmlns:oel="http://schemas.microsoft.com/office/2019/extlst" xmlns:r="http://schemas.openxmlformats.org/officeDocument/2006/relationships" xmlns:m="http://schemas.openxmlformats.org/officeDocument/2006/math" xmlns:v="urn:schemas-microsoft-com:vml" xmlns:wp14="http://schemas.microsoft.com/office/word/2010/wordprocessingDrawing" xmlns:wp="http://schemas.openxmlformats.org/drawingml/2006/wordprocessingDrawing" xmlns:w10="urn:schemas-microsoft-com:office:word" xmlns:w="http://schemas.openxmlformats.org/wordprocessingml/2006/main" xmlns:w14="http://schemas.microsoft.com/office/word/2010/wordml" xmlns:w15="http://schemas.microsoft.com/office/word/2012/wordml" xmlns:w16cex="http://schemas.microsoft.com/office/word/2018/wordml/cex" xmlns:w16cid="http://schemas.microsoft.com/office/word/2016/wordml/cid" xmlns:w16="http://schemas.microsoft.com/office/word/2018/wordml" xmlns:w16du="http://schemas.microsoft.com/office/word/2023/wordml/word16du" xmlns:w16sdtdh="http://schemas.microsoft.com/office/word/2020/wordml/sdtdatahash" xmlns:w16sdtfl="http://schemas.microsoft.com/office/word/2024/wordml/sdtformatlock" xmlns:w16se="http://schemas.microsoft.com/office/word/2015/wordml/symex" xmlns:wpg="http://schemas.microsoft.com/office/word/2010/wordprocessingGroup" xmlns:wpi="http://schemas.microsoft.com/office/word/2010/wordprocessingInk" xmlns:wne="http://schemas.microsoft.com/office/word/2006/wordml" xmlns:wps="http://schemas.microsoft.com/office/word/2010/wordprocessingShape" mc:Ignorable="w14 w15 w16se w16cid w16 w16cex w16sdtdh w16sdtfl w16du wp14">
+<w:hdr xmlns:wpc="http://schemas.microsoft.com/office/word/2010/wordprocessingCanvas" xmlns:cx="http://schemas.microsoft.com/office/drawing/2014/chartex" xmlns:cx1="http://schemas.microsoft.com/office/drawing/2015/9/8/chartex" xmlns:cx2="http://schemas.microsoft.com/office/drawing/2015/10/21/chartex" xmlns:cx3="http://schemas.microsoft.com/office/drawing/2016/5/9/chartex" xmlns:cx4="http://schemas.microsoft.com/office/drawing/2016/5/10/chartex" xmlns:cx5="http://schemas.microsoft.com/office/drawing/2016/5/11/chartex" xmlns:cx6="http://schemas.microsoft.com/office/drawing/2016/5/12/chartex" xmlns:cx7="http://schemas.microsoft.com/office/drawing/2016/5/13/chartex" xmlns:cx8="http://schemas.microsoft.com/office/drawing/2016/5/14/chartex" xmlns:mc="http://schemas.openxmlformats.org/markup-compatibility/2006" xmlns:aink="http://schemas.microsoft.com/office/drawing/2016/ink" xmlns:am3d="http://schemas.microsoft.com/office/drawing/2017/model3d" xmlns:o="urn:schemas-microsoft-com:office:office" xmlns:r="http://schemas.openxmlformats.org/officeDocument/2006/relationships" xmlns:m="http://schemas.openxmlformats.org/officeDocument/2006/math" xmlns:v="urn:schemas-microsoft-com:vml" xmlns:wp14="http://schemas.microsoft.com/office/word/2010/wordprocessingDrawing" xmlns:wp="http://schemas.openxmlformats.org/drawingml/2006/wordprocessingDrawing" xmlns:w10="urn:schemas-microsoft-com:office:word" xmlns:w="http://schemas.openxmlformats.org/wordprocessingml/2006/main" xmlns:w14="http://schemas.microsoft.com/office/word/2010/wordml" xmlns:w15="http://schemas.microsoft.com/office/word/2012/wordml" xmlns:w16cex="http://schemas.microsoft.com/office/word/2018/wordml/cex" xmlns:w16cid="http://schemas.microsoft.com/office/word/2016/wordml/cid" xmlns:w16="http://schemas.microsoft.com/office/word/2018/wordml" xmlns:w16sdtdh="http://schemas.microsoft.com/office/word/2020/wordml/sdtdatahash" xmlns:w16se="http://schemas.microsoft.com/office/word/2015/wordml/symex" xmlns:wpg="http://schemas.microsoft.com/office/word/2010/wordprocessingGroup" xmlns:wpi="http://schemas.microsoft.com/office/word/2010/wordprocessingInk" xmlns:wne="http://schemas.microsoft.com/office/word/2006/wordml" xmlns:wps="http://schemas.microsoft.com/office/word/2010/wordprocessingShape" mc:Ignorable="w14 w15 w16se w16cid w16 w16cex w16sdtdh wp14">
   <w:sdt>
     <w:sdtPr>
       <w:id w:val="637689337"/>
@@ -2780,7 +2757,7 @@
 </file>
 
 <file path=word/numbering.xml><?xml version="1.0" encoding="utf-8"?>
-<w:numbering xmlns:wpc="http://schemas.microsoft.com/office/word/2010/wordprocessingCanvas" xmlns:cx="http://schemas.microsoft.com/office/drawing/2014/chartex" xmlns:cx1="http://schemas.microsoft.com/office/drawing/2015/9/8/chartex" xmlns:cx2="http://schemas.microsoft.com/office/drawing/2015/10/21/chartex" xmlns:cx3="http://schemas.microsoft.com/office/drawing/2016/5/9/chartex" xmlns:cx4="http://schemas.microsoft.com/office/drawing/2016/5/10/chartex" xmlns:cx5="http://schemas.microsoft.com/office/drawing/2016/5/11/chartex" xmlns:cx6="http://schemas.microsoft.com/office/drawing/2016/5/12/chartex" xmlns:cx7="http://schemas.microsoft.com/office/drawing/2016/5/13/chartex" xmlns:cx8="http://schemas.microsoft.com/office/drawing/2016/5/14/chartex" xmlns:mc="http://schemas.openxmlformats.org/markup-compatibility/2006" xmlns:aink="http://schemas.microsoft.com/office/drawing/2016/ink" xmlns:am3d="http://schemas.microsoft.com/office/drawing/2017/model3d" xmlns:o="urn:schemas-microsoft-com:office:office" xmlns:oel="http://schemas.microsoft.com/office/2019/extlst" xmlns:r="http://schemas.openxmlformats.org/officeDocument/2006/relationships" xmlns:m="http://schemas.openxmlformats.org/officeDocument/2006/math" xmlns:v="urn:schemas-microsoft-com:vml" xmlns:wp14="http://schemas.microsoft.com/office/word/2010/wordprocessingDrawing" xmlns:wp="http://schemas.openxmlformats.org/drawingml/2006/wordprocessingDrawing" xmlns:w10="urn:schemas-microsoft-com:office:word" xmlns:w="http://schemas.openxmlformats.org/wordprocessingml/2006/main" xmlns:w14="http://schemas.microsoft.com/office/word/2010/wordml" xmlns:w15="http://schemas.microsoft.com/office/word/2012/wordml" xmlns:w16cex="http://schemas.microsoft.com/office/word/2018/wordml/cex" xmlns:w16cid="http://schemas.microsoft.com/office/word/2016/wordml/cid" xmlns:w16="http://schemas.microsoft.com/office/word/2018/wordml" xmlns:w16du="http://schemas.microsoft.com/office/word/2023/wordml/word16du" xmlns:w16sdtdh="http://schemas.microsoft.com/office/word/2020/wordml/sdtdatahash" xmlns:w16sdtfl="http://schemas.microsoft.com/office/word/2024/wordml/sdtformatlock" xmlns:w16se="http://schemas.microsoft.com/office/word/2015/wordml/symex" xmlns:wpg="http://schemas.microsoft.com/office/word/2010/wordprocessingGroup" xmlns:wpi="http://schemas.microsoft.com/office/word/2010/wordprocessingInk" xmlns:wne="http://schemas.microsoft.com/office/word/2006/wordml" xmlns:wps="http://schemas.microsoft.com/office/word/2010/wordprocessingShape" mc:Ignorable="w14 w15 w16se w16cid w16 w16cex w16sdtdh w16sdtfl w16du wp14">
+<w:numbering xmlns:wpc="http://schemas.microsoft.com/office/word/2010/wordprocessingCanvas" xmlns:cx="http://schemas.microsoft.com/office/drawing/2014/chartex" xmlns:cx1="http://schemas.microsoft.com/office/drawing/2015/9/8/chartex" xmlns:cx2="http://schemas.microsoft.com/office/drawing/2015/10/21/chartex" xmlns:cx3="http://schemas.microsoft.com/office/drawing/2016/5/9/chartex" xmlns:cx4="http://schemas.microsoft.com/office/drawing/2016/5/10/chartex" xmlns:cx5="http://schemas.microsoft.com/office/drawing/2016/5/11/chartex" xmlns:cx6="http://schemas.microsoft.com/office/drawing/2016/5/12/chartex" xmlns:cx7="http://schemas.microsoft.com/office/drawing/2016/5/13/chartex" xmlns:cx8="http://schemas.microsoft.com/office/drawing/2016/5/14/chartex" xmlns:mc="http://schemas.openxmlformats.org/markup-compatibility/2006" xmlns:aink="http://schemas.microsoft.com/office/drawing/2016/ink" xmlns:am3d="http://schemas.microsoft.com/office/drawing/2017/model3d" xmlns:o="urn:schemas-microsoft-com:office:office" xmlns:r="http://schemas.openxmlformats.org/officeDocument/2006/relationships" xmlns:m="http://schemas.openxmlformats.org/officeDocument/2006/math" xmlns:v="urn:schemas-microsoft-com:vml" xmlns:wp14="http://schemas.microsoft.com/office/word/2010/wordprocessingDrawing" xmlns:wp="http://schemas.openxmlformats.org/drawingml/2006/wordprocessingDrawing" xmlns:w10="urn:schemas-microsoft-com:office:word" xmlns:w="http://schemas.openxmlformats.org/wordprocessingml/2006/main" xmlns:w14="http://schemas.microsoft.com/office/word/2010/wordml" xmlns:w15="http://schemas.microsoft.com/office/word/2012/wordml" xmlns:w16cex="http://schemas.microsoft.com/office/word/2018/wordml/cex" xmlns:w16cid="http://schemas.microsoft.com/office/word/2016/wordml/cid" xmlns:w16="http://schemas.microsoft.com/office/word/2018/wordml" xmlns:w16sdtdh="http://schemas.microsoft.com/office/word/2020/wordml/sdtdatahash" xmlns:w16se="http://schemas.microsoft.com/office/word/2015/wordml/symex" xmlns:wpg="http://schemas.microsoft.com/office/word/2010/wordprocessingGroup" xmlns:wpi="http://schemas.microsoft.com/office/word/2010/wordprocessingInk" xmlns:wne="http://schemas.microsoft.com/office/word/2006/wordml" xmlns:wps="http://schemas.microsoft.com/office/word/2010/wordprocessingShape" mc:Ignorable="w14 w15 w16se w16cid w16 w16cex w16sdtdh wp14">
   <w:abstractNum w:abstractNumId="0" w15:restartNumberingAfterBreak="0">
     <w:nsid w:val="1B320BCF"/>
     <w:multiLevelType w:val="hybridMultilevel"/>
@@ -3152,23 +3129,23 @@
       </w:pPr>
     </w:lvl>
   </w:abstractNum>
-  <w:num w:numId="1" w16cid:durableId="1157769499">
+  <w:num w:numId="1">
     <w:abstractNumId w:val="2"/>
   </w:num>
-  <w:num w:numId="2" w16cid:durableId="2049254384">
+  <w:num w:numId="2">
     <w:abstractNumId w:val="3"/>
   </w:num>
-  <w:num w:numId="3" w16cid:durableId="802500898">
+  <w:num w:numId="3">
     <w:abstractNumId w:val="1"/>
   </w:num>
-  <w:num w:numId="4" w16cid:durableId="839586493">
+  <w:num w:numId="4">
     <w:abstractNumId w:val="0"/>
   </w:num>
 </w:numbering>
 </file>
 
 <file path=word/styles.xml><?xml version="1.0" encoding="utf-8"?>
-<w:styles xmlns:mc="http://schemas.openxmlformats.org/markup-compatibility/2006" xmlns:r="http://schemas.openxmlformats.org/officeDocument/2006/relationships" xmlns:w="http://schemas.openxmlformats.org/wordprocessingml/2006/main" xmlns:w14="http://schemas.microsoft.com/office/word/2010/wordml" xmlns:w15="http://schemas.microsoft.com/office/word/2012/wordml" xmlns:w16cex="http://schemas.microsoft.com/office/word/2018/wordml/cex" xmlns:w16cid="http://schemas.microsoft.com/office/word/2016/wordml/cid" xmlns:w16="http://schemas.microsoft.com/office/word/2018/wordml" xmlns:w16du="http://schemas.microsoft.com/office/word/2023/wordml/word16du" xmlns:w16sdtdh="http://schemas.microsoft.com/office/word/2020/wordml/sdtdatahash" xmlns:w16sdtfl="http://schemas.microsoft.com/office/word/2024/wordml/sdtformatlock" xmlns:w16se="http://schemas.microsoft.com/office/word/2015/wordml/symex" mc:Ignorable="w14 w15 w16se w16cid w16 w16cex w16sdtdh w16sdtfl w16du">
+<w:styles xmlns:mc="http://schemas.openxmlformats.org/markup-compatibility/2006" xmlns:r="http://schemas.openxmlformats.org/officeDocument/2006/relationships" xmlns:w="http://schemas.openxmlformats.org/wordprocessingml/2006/main" xmlns:w14="http://schemas.microsoft.com/office/word/2010/wordml" xmlns:w15="http://schemas.microsoft.com/office/word/2012/wordml" xmlns:w16cex="http://schemas.microsoft.com/office/word/2018/wordml/cex" xmlns:w16cid="http://schemas.microsoft.com/office/word/2016/wordml/cid" xmlns:w16="http://schemas.microsoft.com/office/word/2018/wordml" xmlns:w16sdtdh="http://schemas.microsoft.com/office/word/2020/wordml/sdtdatahash" xmlns:w16se="http://schemas.microsoft.com/office/word/2015/wordml/symex" mc:Ignorable="w14 w15 w16se w16cid w16 w16cex w16sdtdh">
   <w:docDefaults>
     <w:rPrDefault>
       <w:rPr>

</xml_diff>